<commit_message>
feat(proposals): institution directory search, batch co-investigator invites, budget preview
</commit_message>
<xml_diff>
--- a/Claude outputs/sample-project-joy-owango/TRIAGE-KE_Manuscript.docx
+++ b/Claude outputs/sample-project-joy-owango/TRIAGE-KE_Manuscript.docx
@@ -225,7 +225,7 @@
         <w:t xml:space="preserve">Methods: </w:t>
       </w:r>
       <w:r>
-        <w:t xml:space="preserve">We conducted a multi-site pre–post implementation study with interrupted time-series (ITS) analysis in three county referral hospital EDs. We compared a 3-month baseline (November 2025–January 2026) with a 6-month implementation period (February–July 2026). Triage decisions were compared with a blinded two-physician reference standard. The primary outcome was under-triage. Secondary outcomes were over-triage, weighted agreement (κ), time to triage and clinician usability (System Usability Scale, SUS).</w:t>
+        <w:t xml:space="preserve">We conducted a multi-site pre–post implementation study with interrupted time-series (ITS) analysis in three county referral hospital EDs. We compared a 3-month baseline (December 2026–February 2027) with a 6-month implementation period (March–August 2027). Triage decisions were compared with a blinded two-physician reference standard. The primary outcome was under-triage. Secondary outcomes were over-triage, weighted agreement (κ), time to triage and clinician usability (System Usability Scale, SUS).</w:t>
       </w:r>
     </w:p>
     <w:p>
@@ -336,7 +336,7 @@
         <w:jc w:val="both"/>
       </w:pPr>
       <w:r>
-        <w:t xml:space="preserve">We conducted a multi-site pre–post implementation study with ITS analysis [5] in the EDs of three county referral hospitals in Kisumu, Nakuru and Machakos counties, Kenya. All three EDs used paper-based SATS triage performed by nurses before the study. The study ran from October 2025 to July 2026, comprising preparation (October–November 2025), baseline (November 2025–January 2026) and implementation (February–July 2026) periods.</w:t>
+        <w:t xml:space="preserve">We conducted a multi-site pre–post implementation study with ITS analysis [5] in the EDs of three county referral hospitals in Kisumu, Nakuru and Machakos counties, Kenya. All three EDs used paper-based SATS triage performed by nurses before the study. The study ran from October 2026 to August 2027, comprising preparation (late October–November 2026), baseline (December 2026–February 2027) and implementation (March–August 2027) periods.</w:t>
       </w:r>
     </w:p>
     <w:p>
@@ -426,7 +426,7 @@
         <w:jc w:val="both"/>
       </w:pPr>
       <w:r>
-        <w:t xml:space="preserve">The study was approved by the National Research Ethics &amp; Innovation Board (Demo) (ref. NREIB/ERC/2025/0417; 22 September 2025). A waiver of individual consent was granted for de-identified record abstraction, with opt-out notices displayed in English and Kiswahili. Clinicians gave written informed consent for the survey. A pre-specified stopping rule required suspension if under-triage rose more than 5 percentage points above baseline for two consecutive weeks.</w:t>
+        <w:t xml:space="preserve">The study was approved by the National Research Ethics &amp; Innovation Board (Demo) (ref. NREIB/ERC/2026/0417; 6 October 2026). A waiver of individual consent was granted for de-identified record abstraction, with opt-out notices displayed in English and Kiswahili. Clinicians gave written informed consent for the survey. A pre-specified stopping rule required suspension if under-triage rose more than 5 percentage points above baseline for two consecutive weeks.</w:t>
       </w:r>
     </w:p>
     <w:p>
@@ -3069,7 +3069,7 @@
         <w:t xml:space="preserve">Ethics approval and consent: </w:t>
       </w:r>
       <w:r>
-        <w:t xml:space="preserve">National Research Ethics &amp; Innovation Board (Demo), ref. NREIB/ERC/2025/0417, approved 22 September 2025. Consent procedures are described in Methods.</w:t>
+        <w:t xml:space="preserve">National Research Ethics &amp; Innovation Board (Demo), ref. NREIB/ERC/2026/0417, approved 6 October 2026. Consent procedures are described in Methods.</w:t>
       </w:r>
     </w:p>
     <w:p>
@@ -3085,7 +3085,7 @@
         <w:t xml:space="preserve">Funding: </w:t>
       </w:r>
       <w:r>
-        <w:t xml:space="preserve">Hospitium Digital Health Innovation Fund (Demo), grant HDHIF/2025/017. The funder had no role in study design, analysis or the decision to publish.</w:t>
+        <w:t xml:space="preserve">Hospitium Digital Health Innovation Fund (Demo), grant HDHIF/2026/017. The funder had no role in study design, analysis or the decision to publish.</w:t>
       </w:r>
     </w:p>
     <w:p>
@@ -3450,7 +3450,7 @@
         <w:sz w:val="16"/>
         <w:szCs w:val="16"/>
       </w:rPr>
-      <w:t xml:space="preserve">TRIAGE-KE · Owango et al. · SAMPLE MANUSCRIPT – synthetic data for HospitiumRIS testing</w:t>
+      <w:t xml:space="preserve">TRIAGE-KE · Owango et al. · SAMPLE MANUSCRIPT – synthetic projected data for HospitiumRIS testing</w:t>
     </w:r>
   </w:p>
 </w:hdr>

</xml_diff>